<commit_message>
Add AI-Assisted Dev skills, update CV
Co-Authored-By: Claude Opus 4.8 <noreply@anthropic.com>
</commit_message>
<xml_diff>
--- a/Vangelis-Mitsianis-CV.docx
+++ b/Vangelis-Mitsianis-CV.docx
@@ -51,7 +51,7 @@
         </w:rPr>
         <w:t xml:space="preserve">+30 6978 110 459  •  </w:t>
       </w:r>
-      <w:hyperlink w:history="1" r:id="rId7la28pw-ok16udiqyouwx">
+      <w:hyperlink w:history="1" r:id="rIdj4frquf7itlv93380jhlv">
         <w:r>
           <w:rPr>
             <w:rStyle w:val="Hyperlink"/>
@@ -68,7 +68,7 @@
         </w:rPr>
         <w:t xml:space="preserve">  •  </w:t>
       </w:r>
-      <w:hyperlink w:history="1" r:id="rIdiu4wyghywy9ssc6scgndj">
+      <w:hyperlink w:history="1" r:id="rIdkyfgi45fqqzuc3l4n7wig">
         <w:r>
           <w:rPr>
             <w:rStyle w:val="Hyperlink"/>
@@ -85,7 +85,7 @@
         </w:rPr>
         <w:t xml:space="preserve">  •  </w:t>
       </w:r>
-      <w:hyperlink w:history="1" r:id="rIdc6wdz9azmunywbb4ellyv">
+      <w:hyperlink w:history="1" r:id="rIddc9hwspy5aco4l8t7pnmo">
         <w:r>
           <w:rPr>
             <w:rStyle w:val="Hyperlink"/>
@@ -246,6 +246,28 @@
           <w:sz w:val="21"/>
           <w:szCs w:val="21"/>
         </w:rPr>
+        <w:t xml:space="preserve">AI-Assisted Dev: </w:t>
+      </w:r>
+      <w:r>
+        <w:rPr>
+          <w:sz w:val="21"/>
+          <w:szCs w:val="21"/>
+        </w:rPr>
+        <w:t xml:space="preserve">Claude, Claude Code, GitHub Copilot, OpenAI API, RAG, building AI-powered features</w:t>
+      </w:r>
+    </w:p>
+    <w:p>
+      <w:pPr>
+        <w:spacing w:after="30"/>
+      </w:pPr>
+      <w:r>
+        <w:rPr>
+          <w:b/>
+          <w:bCs/>
+          <w:color w:val="222222"/>
+          <w:sz w:val="21"/>
+          <w:szCs w:val="21"/>
+        </w:rPr>
         <w:t xml:space="preserve">Testing &amp; Tools: </w:t>
       </w:r>
       <w:r>
@@ -253,7 +275,7 @@
           <w:sz w:val="21"/>
           <w:szCs w:val="21"/>
         </w:rPr>
-        <w:t xml:space="preserve">Jest, Cypress, Figma, GitHub Copilot, Agile / Scrum</w:t>
+        <w:t xml:space="preserve">Jest, Cypress, Figma, Agile / Scrum</w:t>
       </w:r>
     </w:p>
     <w:p>

</xml_diff>